<commit_message>
updated main code by adding remaining regions
</commit_message>
<xml_diff>
--- a/Smart Traffic Project/report/Major report.docx
+++ b/Smart Traffic Project/report/Major report.docx
@@ -342,6 +342,19 @@
         </w:rPr>
         <w:t xml:space="preserve">Link : </w:t>
       </w:r>
+      <w:hyperlink r:id="rId5" w:history="1">
+        <w:r>
+          <w:rPr>
+            <w:rStyle w:val="Hyperlink"/>
+            <w:rFonts w:ascii="Times New Roman" w:hAnsi="Times New Roman" w:cs="Times New Roman"/>
+            <w:b/>
+            <w:bCs/>
+            <w:sz w:val="36"/>
+            <w:szCs w:val="36"/>
+          </w:rPr>
+          <w:t>https://github.com/DeveloperHarshal92/traffic-system.git</w:t>
+        </w:r>
+      </w:hyperlink>
     </w:p>
     <w:p>
       <w:pPr>
@@ -435,7 +448,6 @@
           <w:sz w:val="96"/>
           <w:szCs w:val="96"/>
         </w:rPr>
-        <w:lastRenderedPageBreak/>
         <w:t>INDEX</w:t>
       </w:r>
     </w:p>
@@ -1362,7 +1374,6 @@
           <w:sz w:val="36"/>
           <w:szCs w:val="36"/>
         </w:rPr>
-        <w:lastRenderedPageBreak/>
         <w:t>CHAPTER 1: INTRODUCTION</w:t>
       </w:r>
     </w:p>
@@ -1698,6 +1709,7 @@
           <w:sz w:val="28"/>
           <w:szCs w:val="28"/>
         </w:rPr>
+        <w:lastRenderedPageBreak/>
         <w:t>Manual monitoring of traffic is inefficient.</w:t>
       </w:r>
     </w:p>
@@ -1721,7 +1733,6 @@
           <w:sz w:val="28"/>
           <w:szCs w:val="28"/>
         </w:rPr>
-        <w:lastRenderedPageBreak/>
         <w:t>Congested intersections with delays and long queues.</w:t>
       </w:r>
     </w:p>
@@ -2180,6 +2191,7 @@
           <w:sz w:val="28"/>
           <w:szCs w:val="28"/>
         </w:rPr>
+        <w:lastRenderedPageBreak/>
         <w:t>Simulation of smart traffic model</w:t>
       </w:r>
       <w:r>
@@ -2212,7 +2224,6 @@
           <w:sz w:val="28"/>
           <w:szCs w:val="28"/>
         </w:rPr>
-        <w:lastRenderedPageBreak/>
         <w:t>IRL deployment on city roads</w:t>
       </w:r>
     </w:p>
@@ -2720,7 +2731,6 @@
           <w:sz w:val="36"/>
           <w:szCs w:val="36"/>
         </w:rPr>
-        <w:lastRenderedPageBreak/>
         <w:t xml:space="preserve">CHAPTER 2 </w:t>
       </w:r>
       <w:r>
@@ -3038,6 +3048,7 @@
           <w:sz w:val="28"/>
           <w:szCs w:val="28"/>
         </w:rPr>
+        <w:lastRenderedPageBreak/>
         <w:t>Magnetic loops</w:t>
       </w:r>
     </w:p>
@@ -3084,7 +3095,6 @@
           <w:sz w:val="28"/>
           <w:szCs w:val="28"/>
         </w:rPr>
-        <w:lastRenderedPageBreak/>
         <w:t>Ultrasonic detectors</w:t>
       </w:r>
     </w:p>
@@ -3558,6 +3568,7 @@
           <w:sz w:val="28"/>
           <w:szCs w:val="28"/>
         </w:rPr>
+        <w:lastRenderedPageBreak/>
         <w:t>Vehicle-to-infrastructure data sharing</w:t>
       </w:r>
     </w:p>
@@ -3600,7 +3611,6 @@
           <w:sz w:val="28"/>
           <w:szCs w:val="28"/>
         </w:rPr>
-        <w:lastRenderedPageBreak/>
         <w:t>Remote monitoring</w:t>
       </w:r>
     </w:p>
@@ -3956,6 +3966,14 @@
           <w:szCs w:val="28"/>
         </w:rPr>
         <w:br/>
+      </w:r>
+      <w:r>
+        <w:rPr>
+          <w:rFonts w:ascii="Times New Roman" w:hAnsi="Times New Roman" w:cs="Times New Roman"/>
+          <w:sz w:val="28"/>
+          <w:szCs w:val="28"/>
+        </w:rPr>
+        <w:lastRenderedPageBreak/>
         <w:t>This provides a strong foundation for the methodology and implementation discussed in the upcoming chapters.</w:t>
       </w:r>
     </w:p>
@@ -3990,7 +4008,6 @@
           <w:sz w:val="32"/>
           <w:szCs w:val="32"/>
         </w:rPr>
-        <w:lastRenderedPageBreak/>
         <w:t>AI MODELS USED IN TRAFFIC OPTIMIZATION</w:t>
       </w:r>
     </w:p>
@@ -4425,6 +4442,7 @@
           <w:sz w:val="28"/>
           <w:szCs w:val="28"/>
         </w:rPr>
+        <w:lastRenderedPageBreak/>
         <w:t>This creates a space for your project: A lightweight, practical, real-time traffic optimization system using Python, OpenCV, and AI.</w:t>
       </w:r>
     </w:p>
@@ -4470,7 +4488,6 @@
           <w:sz w:val="32"/>
           <w:szCs w:val="32"/>
         </w:rPr>
-        <w:lastRenderedPageBreak/>
         <w:t>SUMMARY</w:t>
       </w:r>
     </w:p>
@@ -4792,7 +4809,6 @@
           <w:sz w:val="36"/>
           <w:szCs w:val="36"/>
         </w:rPr>
-        <w:lastRenderedPageBreak/>
         <w:t>CHAPTER 3: METHODOLOGY</w:t>
       </w:r>
     </w:p>
@@ -4899,7 +4915,7 @@
                     <pic:cNvPicPr/>
                   </pic:nvPicPr>
                   <pic:blipFill>
-                    <a:blip r:embed="rId5"/>
+                    <a:blip r:embed="rId6"/>
                     <a:stretch>
                       <a:fillRect/>
                     </a:stretch>
@@ -4987,7 +5003,16 @@
           <w:sz w:val="28"/>
           <w:szCs w:val="28"/>
         </w:rPr>
-        <w:t>, objects are detected, and vehicles such as cars, bikes, buses, and trucks are identified. This block converts visual information into detectable and countable objects.</w:t>
+        <w:t xml:space="preserve">, objects are detected, and vehicles such </w:t>
+      </w:r>
+      <w:r>
+        <w:rPr>
+          <w:rFonts w:ascii="Times New Roman" w:hAnsi="Times New Roman" w:cs="Times New Roman"/>
+          <w:sz w:val="28"/>
+          <w:szCs w:val="28"/>
+        </w:rPr>
+        <w:lastRenderedPageBreak/>
+        <w:t>as cars, bikes, buses, and trucks are identified. This block converts visual information into detectable and countable objects.</w:t>
       </w:r>
     </w:p>
     <w:p>
@@ -5032,7 +5057,6 @@
           <w:sz w:val="32"/>
           <w:szCs w:val="32"/>
         </w:rPr>
-        <w:lastRenderedPageBreak/>
         <w:t>3. Density Estimation</w:t>
       </w:r>
     </w:p>
@@ -5334,6 +5358,7 @@
           <w:sz w:val="28"/>
           <w:szCs w:val="28"/>
         </w:rPr>
+        <w:lastRenderedPageBreak/>
         <w:t>A web dashboard displays traffic flow, density, and signal timing analytics. Operators can monitor system performance and update calibration settings. The dashboard improves transparency and helps in validating AI decisions.</w:t>
       </w:r>
     </w:p>
@@ -5370,7 +5395,6 @@
           <w:sz w:val="36"/>
           <w:szCs w:val="36"/>
         </w:rPr>
-        <w:lastRenderedPageBreak/>
         <w:t xml:space="preserve">CHAPTER </w:t>
       </w:r>
       <w:r>
@@ -6020,6 +6044,7 @@
                 <w:sz w:val="28"/>
                 <w:szCs w:val="28"/>
               </w:rPr>
+              <w:lastRenderedPageBreak/>
               <w:t>LED Signal Simulation</w:t>
             </w:r>
           </w:p>
@@ -6141,7 +6166,6 @@
           <w:sz w:val="28"/>
           <w:szCs w:val="28"/>
         </w:rPr>
-        <w:lastRenderedPageBreak/>
         <w:t>Detect vehicles in each frame.</w:t>
       </w:r>
     </w:p>
@@ -6555,6 +6579,7 @@
           <w:sz w:val="28"/>
           <w:szCs w:val="28"/>
         </w:rPr>
+        <w:lastRenderedPageBreak/>
         <w:t>Purpose:</w:t>
       </w:r>
     </w:p>
@@ -6784,7 +6809,6 @@
           <w:sz w:val="28"/>
           <w:szCs w:val="28"/>
         </w:rPr>
-        <w:lastRenderedPageBreak/>
         <w:t xml:space="preserve">If </w:t>
       </w:r>
       <w:proofErr w:type="spellStart"/>
@@ -7226,7 +7250,7 @@
                     <pic:cNvPicPr/>
                   </pic:nvPicPr>
                   <pic:blipFill>
-                    <a:blip r:embed="rId6" cstate="print">
+                    <a:blip r:embed="rId7" cstate="print">
                       <a:extLst>
                         <a:ext uri="{28A0092B-C50C-407E-A947-70E740481C1C}">
                           <a14:useLocalDpi xmlns:a14="http://schemas.microsoft.com/office/drawing/2010/main" val="0"/>
@@ -7319,7 +7343,7 @@
                     <pic:cNvPicPr/>
                   </pic:nvPicPr>
                   <pic:blipFill>
-                    <a:blip r:embed="rId7" cstate="print">
+                    <a:blip r:embed="rId8" cstate="print">
                       <a:extLst>
                         <a:ext uri="{28A0092B-C50C-407E-A947-70E740481C1C}">
                           <a14:useLocalDpi xmlns:a14="http://schemas.microsoft.com/office/drawing/2010/main" val="0"/>
@@ -8298,7 +8322,7 @@
                     <pic:cNvPicPr/>
                   </pic:nvPicPr>
                   <pic:blipFill>
-                    <a:blip r:embed="rId8"/>
+                    <a:blip r:embed="rId9"/>
                     <a:stretch>
                       <a:fillRect/>
                     </a:stretch>
@@ -8616,7 +8640,7 @@
                     <pic:cNvPicPr/>
                   </pic:nvPicPr>
                   <pic:blipFill>
-                    <a:blip r:embed="rId9" cstate="print">
+                    <a:blip r:embed="rId10" cstate="print">
                       <a:extLst>
                         <a:ext uri="{28A0092B-C50C-407E-A947-70E740481C1C}">
                           <a14:useLocalDpi xmlns:a14="http://schemas.microsoft.com/office/drawing/2010/main" val="0"/>
@@ -10808,25 +10832,7 @@
           <w:sz w:val="28"/>
           <w:szCs w:val="28"/>
         </w:rPr>
-        <w:t xml:space="preserve"> 20–25 </w:t>
-      </w:r>
-      <w:proofErr w:type="gramStart"/>
-      <w:r>
-        <w:rPr>
-          <w:rFonts w:ascii="Times New Roman" w:hAnsi="Times New Roman" w:cs="Times New Roman"/>
-          <w:sz w:val="28"/>
-          <w:szCs w:val="28"/>
-        </w:rPr>
-        <w:t>seconds</w:t>
-      </w:r>
-      <w:proofErr w:type="gramEnd"/>
-      <w:r>
-        <w:rPr>
-          <w:rFonts w:ascii="Times New Roman" w:hAnsi="Times New Roman" w:cs="Times New Roman"/>
-          <w:sz w:val="28"/>
-          <w:szCs w:val="28"/>
-        </w:rPr>
-        <w:t xml:space="preserve"> green time</w:t>
+        <w:t xml:space="preserve"> 20–25 seconds green time</w:t>
       </w:r>
     </w:p>
     <w:p>
@@ -13754,25 +13760,7 @@
           <w:sz w:val="28"/>
           <w:szCs w:val="28"/>
         </w:rPr>
-        <w:t xml:space="preserve">                    # </w:t>
-      </w:r>
-      <w:proofErr w:type="gramStart"/>
-      <w:r>
-        <w:rPr>
-          <w:rFonts w:ascii="Times New Roman" w:hAnsi="Times New Roman" w:cs="Times New Roman"/>
-          <w:sz w:val="28"/>
-          <w:szCs w:val="28"/>
-        </w:rPr>
-        <w:t>draw</w:t>
-      </w:r>
-      <w:proofErr w:type="gramEnd"/>
-      <w:r>
-        <w:rPr>
-          <w:rFonts w:ascii="Times New Roman" w:hAnsi="Times New Roman" w:cs="Times New Roman"/>
-          <w:sz w:val="28"/>
-          <w:szCs w:val="28"/>
-        </w:rPr>
-        <w:t xml:space="preserve"> box</w:t>
+        <w:t>                    # draw box</w:t>
       </w:r>
     </w:p>
     <w:p>
@@ -14116,25 +14104,7 @@
           <w:sz w:val="28"/>
           <w:szCs w:val="28"/>
         </w:rPr>
-        <w:t xml:space="preserve">            # </w:t>
-      </w:r>
-      <w:proofErr w:type="gramStart"/>
-      <w:r>
-        <w:rPr>
-          <w:rFonts w:ascii="Times New Roman" w:hAnsi="Times New Roman" w:cs="Times New Roman"/>
-          <w:sz w:val="28"/>
-          <w:szCs w:val="28"/>
-        </w:rPr>
-        <w:t>show</w:t>
-      </w:r>
-      <w:proofErr w:type="gramEnd"/>
-      <w:r>
-        <w:rPr>
-          <w:rFonts w:ascii="Times New Roman" w:hAnsi="Times New Roman" w:cs="Times New Roman"/>
-          <w:sz w:val="28"/>
-          <w:szCs w:val="28"/>
-        </w:rPr>
-        <w:t xml:space="preserve"> smoothed queue length</w:t>
+        <w:t>            # show smoothed queue length</w:t>
       </w:r>
     </w:p>
     <w:p>
@@ -14271,25 +14241,7 @@
           <w:sz w:val="28"/>
           <w:szCs w:val="28"/>
         </w:rPr>
-        <w:t xml:space="preserve">        # </w:t>
-      </w:r>
-      <w:proofErr w:type="gramStart"/>
-      <w:r>
-        <w:rPr>
-          <w:rFonts w:ascii="Times New Roman" w:hAnsi="Times New Roman" w:cs="Times New Roman"/>
-          <w:sz w:val="28"/>
-          <w:szCs w:val="28"/>
-        </w:rPr>
-        <w:t>show</w:t>
-      </w:r>
-      <w:proofErr w:type="gramEnd"/>
-      <w:r>
-        <w:rPr>
-          <w:rFonts w:ascii="Times New Roman" w:hAnsi="Times New Roman" w:cs="Times New Roman"/>
-          <w:sz w:val="28"/>
-          <w:szCs w:val="28"/>
-        </w:rPr>
-        <w:t xml:space="preserve"> timer</w:t>
+        <w:t>        # show timer</w:t>
       </w:r>
     </w:p>
     <w:p>
@@ -15210,7 +15162,7 @@
                     <pic:cNvPicPr/>
                   </pic:nvPicPr>
                   <pic:blipFill>
-                    <a:blip r:embed="rId7" cstate="print">
+                    <a:blip r:embed="rId8" cstate="print">
                       <a:extLst>
                         <a:ext uri="{28A0092B-C50C-407E-A947-70E740481C1C}">
                           <a14:useLocalDpi xmlns:a14="http://schemas.microsoft.com/office/drawing/2010/main" val="0"/>

</xml_diff>